<commit_message>
fix(contracts): ensure strict ECMA-376 OpenXML schema compliance for 100% Word on Windows compatibility
</commit_message>
<xml_diff>
--- a/docs/contracts/contrat_recolte_fas_agri.docx
+++ b/docs/contracts/contrat_recolte_fas_agri.docx
@@ -4,10 +4,10 @@
   <w:body>
     <w:tbl>
       <w:tblPr>
+        <w:bidiVisual/>
         <w:tblW w:type="auto" w:w="0"/>
         <w:jc w:val="center"/>
         <w:tblLook w:firstColumn="1" w:firstRow="1" w:lastColumn="0" w:lastRow="0" w:noHBand="0" w:noVBand="1" w:val="04A0"/>
-        <w:bidiVisual/>
       </w:tblPr>
       <w:tblGrid>
         <w:gridCol w:w="10037"/>
@@ -31,10 +31,10 @@
             </w:pPr>
             <w:r>
               <w:rPr>
+                <w:rFonts w:ascii="Arial" w:hAnsi="Arial" w:cs="Arial"/>
                 <w:b/>
                 <w:color w:val="FFFFFF"/>
                 <w:sz w:val="26"/>
-                <w:rFonts w:ascii="Arial" w:hAnsi="Arial" w:cs="Arial"/>
                 <w:rtl/>
               </w:rPr>
               <w:t>شركة منصة الزين لزيت الزيتون التونسي (SUARL) - ZinToop</w:t>
@@ -47,9 +47,9 @@
             </w:pPr>
             <w:r>
               <w:rPr>
+                <w:rFonts w:ascii="Arial" w:hAnsi="Arial" w:cs="Arial"/>
                 <w:color w:val="C8A356"/>
                 <w:sz w:val="19"/>
-                <w:rFonts w:ascii="Arial" w:hAnsi="Arial" w:cs="Arial"/>
                 <w:rtl/>
               </w:rPr>
               <w:t>المعرف الجبائي (RNE): 1969552S  •  عدد التصرف الداخلي: B5094322026</w:t>
@@ -62,9 +62,9 @@
             </w:pPr>
             <w:r>
               <w:rPr>
+                <w:rFonts w:ascii="Arial" w:hAnsi="Arial" w:cs="Arial"/>
                 <w:color w:val="DCDCDC"/>
                 <w:sz w:val="17"/>
-                <w:rFonts w:ascii="Arial" w:hAnsi="Arial" w:cs="Arial"/>
                 <w:rtl/>
               </w:rPr>
               <w:t>المقر: فيلا HUB، حدائق الخضراوي، حي ابن الجزار، س1، دار الأمان، 3140 القيروان  •  الهاتف: 25 777 926  •  contact@zintoop.com</w:t>
@@ -81,10 +81,10 @@
       </w:pPr>
       <w:r>
         <w:rPr>
+          <w:rFonts w:ascii="Arial" w:hAnsi="Arial" w:cs="Arial"/>
           <w:b/>
           <w:color w:val="1B2A1B"/>
           <w:sz w:val="32"/>
-          <w:rFonts w:ascii="Arial" w:hAnsi="Arial" w:cs="Arial"/>
           <w:rtl/>
         </w:rPr>
         <w:t>عقد تقديم خدمات جني صابة الزيتون</w:t>
@@ -97,10 +97,10 @@
       </w:pPr>
       <w:r>
         <w:rPr>
+          <w:rFonts w:ascii="Arial" w:hAnsi="Arial" w:cs="Arial"/>
           <w:b/>
           <w:color w:val="8C6B12"/>
           <w:sz w:val="21"/>
-          <w:rFonts w:ascii="Arial" w:hAnsi="Arial" w:cs="Arial"/>
           <w:rtl/>
         </w:rPr>
         <w:t>الموسم الفلاحي: 2026 / 2027  •  ضيعات ولاية زغوان (500 طن زيتون)</w:t>
@@ -113,10 +113,10 @@
       </w:pPr>
       <w:r>
         <w:rPr>
+          <w:rFonts w:ascii="Arial" w:hAnsi="Arial" w:cs="Arial"/>
           <w:b/>
           <w:color w:val="64748B"/>
           <w:sz w:val="19"/>
-          <w:rFonts w:ascii="Arial" w:hAnsi="Arial" w:cs="Arial"/>
           <w:rtl/>
         </w:rPr>
         <w:t>تونس / القيروان في: ...... / ...... / 2026</w:t>
@@ -129,9 +129,9 @@
       </w:pPr>
       <w:r>
         <w:rPr>
+          <w:rFonts w:ascii="Arial" w:hAnsi="Arial" w:cs="Arial"/>
           <w:b/>
           <w:sz w:val="21"/>
-          <w:rFonts w:ascii="Arial" w:hAnsi="Arial" w:cs="Arial"/>
           <w:rtl/>
         </w:rPr>
         <w:t>وقع الاتفاق والتراضي التام بين الممضيين أسفله:</w:t>
@@ -139,10 +139,10 @@
     </w:p>
     <w:tbl>
       <w:tblPr>
+        <w:bidiVisual/>
         <w:tblW w:type="auto" w:w="0"/>
         <w:jc w:val="center"/>
         <w:tblLook w:firstColumn="1" w:firstRow="1" w:lastColumn="0" w:lastRow="0" w:noHBand="0" w:noVBand="1" w:val="04A0"/>
-        <w:bidiVisual/>
       </w:tblPr>
       <w:tblGrid>
         <w:gridCol w:w="10037"/>
@@ -151,6 +151,12 @@
         <w:tc>
           <w:tcPr>
             <w:tcW w:type="dxa" w:w="10037"/>
+            <w:tcBorders>
+              <w:top w:val="single" w:sz="6" w:space="0" w:color="C8A356"/>
+              <w:left w:val="single" w:sz="6" w:space="0" w:color="C8A356"/>
+              <w:bottom w:val="single" w:sz="4" w:space="0" w:color="E2E8F0"/>
+              <w:right w:val="single" w:sz="6" w:space="0" w:color="C8A356"/>
+            </w:tcBorders>
             <w:shd w:fill="F8FAF8"/>
             <w:tcMar>
               <w:top w:w="80" w:type="dxa"/>
@@ -158,12 +164,6 @@
               <w:left w:w="120" w:type="dxa"/>
               <w:right w:w="120" w:type="dxa"/>
             </w:tcMar>
-            <w:tcBorders>
-              <w:top w:val="single" w:sz="6" w:space="0" w:color="C8A356"/>
-              <w:left w:val="single" w:sz="6" w:space="0" w:color="C8A356"/>
-              <w:bottom w:val="single" w:sz="4" w:space="0" w:color="E2E8F0"/>
-              <w:right w:val="single" w:sz="6" w:space="0" w:color="C8A356"/>
-            </w:tcBorders>
           </w:tcPr>
           <w:p>
             <w:pPr>
@@ -172,10 +172,10 @@
             </w:pPr>
             <w:r>
               <w:rPr>
+                <w:rFonts w:ascii="Arial" w:hAnsi="Arial" w:cs="Arial"/>
                 <w:b/>
                 <w:color w:val="1B2A1B"/>
                 <w:sz w:val="20"/>
-                <w:rFonts w:ascii="Arial" w:hAnsi="Arial" w:cs="Arial"/>
                 <w:rtl/>
               </w:rPr>
               <w:t>الطرف الأول: مسدي الخدمات (ZinToop)</w:t>
@@ -188,8 +188,8 @@
             </w:pPr>
             <w:r>
               <w:rPr>
+                <w:rFonts w:ascii="Arial" w:hAnsi="Arial" w:cs="Arial"/>
                 <w:sz w:val="19"/>
-                <w:rFonts w:ascii="Arial" w:hAnsi="Arial" w:cs="Arial"/>
                 <w:rtl/>
               </w:rPr>
               <w:t>شركة منصة الزين لزيت الزيتون التونسي (ZinToop SUARL)، شركة الشخص الواحد ذات المسؤولية المحدودة، المعرف الجبائي عدد: 1969552S، ومقرها الاجتماعي الكائن بـ دار الأمان، حدائق الخضراوي، 3140 القيروان، ويمثلها بخصوص هذا العقد وكيلها وممثلها القانوني السيد حمدي الزين (Ezzine Hamdi)، صاحب بطاقة التعريف الوطنية عدد: 07712882.</w:t>
@@ -201,6 +201,12 @@
         <w:tc>
           <w:tcPr>
             <w:tcW w:type="dxa" w:w="10037"/>
+            <w:tcBorders>
+              <w:top w:val="single" w:sz="4" w:space="0" w:color="E2E8F0"/>
+              <w:left w:val="single" w:sz="6" w:space="0" w:color="C8A356"/>
+              <w:bottom w:val="single" w:sz="6" w:space="0" w:color="C8A356"/>
+              <w:right w:val="single" w:sz="6" w:space="0" w:color="C8A356"/>
+            </w:tcBorders>
             <w:shd w:fill="F8FAF8"/>
             <w:tcMar>
               <w:top w:w="80" w:type="dxa"/>
@@ -208,12 +214,6 @@
               <w:left w:w="120" w:type="dxa"/>
               <w:right w:w="120" w:type="dxa"/>
             </w:tcMar>
-            <w:tcBorders>
-              <w:top w:val="single" w:sz="4" w:space="0" w:color="E2E8F0"/>
-              <w:left w:val="single" w:sz="6" w:space="0" w:color="C8A356"/>
-              <w:bottom w:val="single" w:sz="6" w:space="0" w:color="C8A356"/>
-              <w:right w:val="single" w:sz="6" w:space="0" w:color="C8A356"/>
-            </w:tcBorders>
           </w:tcPr>
           <w:p>
             <w:pPr>
@@ -222,10 +222,10 @@
             </w:pPr>
             <w:r>
               <w:rPr>
+                <w:rFonts w:ascii="Arial" w:hAnsi="Arial" w:cs="Arial"/>
                 <w:b/>
                 <w:color w:val="1B2A1B"/>
                 <w:sz w:val="20"/>
-                <w:rFonts w:ascii="Arial" w:hAnsi="Arial" w:cs="Arial"/>
                 <w:rtl/>
               </w:rPr>
               <w:t>الطرف الثاني: المستفيد - صاحب الضيعة (FAS AGRI)</w:t>
@@ -238,8 +238,8 @@
             </w:pPr>
             <w:r>
               <w:rPr>
+                <w:rFonts w:ascii="Arial" w:hAnsi="Arial" w:cs="Arial"/>
                 <w:sz w:val="19"/>
-                <w:rFonts w:ascii="Arial" w:hAnsi="Arial" w:cs="Arial"/>
                 <w:rtl/>
               </w:rPr>
               <w:t>شركة فاس أقري (FAS AGRI SARL)، شركة ذات المسؤولية المحدودة، المعرف الجبائي عدد: 1772025K، ومقرها الاجتماعي الكائن بـ: 100 نهج الحسين بوزيان – باب البحر – تونس 1001، ويمثلها قانونياً وكيلها السيد محمد حسين صفر.</w:t>
@@ -256,10 +256,10 @@
       </w:pPr>
       <w:r>
         <w:rPr>
+          <w:rFonts w:ascii="Arial" w:hAnsi="Arial" w:cs="Arial"/>
           <w:b/>
           <w:color w:val="1B2A1B"/>
           <w:sz w:val="22"/>
-          <w:rFonts w:ascii="Arial" w:hAnsi="Arial" w:cs="Arial"/>
           <w:rtl/>
         </w:rPr>
         <w:t>📋 الفصل 1: موضوع العقد والكميات ونسق الجني اليومي التصاعدي</w:t>
@@ -272,9 +272,9 @@
       </w:pPr>
       <w:r>
         <w:rPr>
+          <w:rFonts w:ascii="Arial" w:hAnsi="Arial" w:cs="Arial"/>
           <w:color w:val="282828"/>
           <w:sz w:val="19"/>
-          <w:rFonts w:ascii="Arial" w:hAnsi="Arial" w:cs="Arial"/>
           <w:rtl/>
         </w:rPr>
         <w:t>يتمثل هذا العقد في تعهد والتزام الطرف الأول (شركة منصة الزين - ZinToop) بالقيام بأشغال الجني الميكانيكي لمحصول الزيتون بالضيعات الفلاحية التابعة لـ الطرف الثاني (شركة فاس أقري) الكائنة بولاية زغوان، وذلك خلال الموسم الفلاحي 2026 / 2027.</w:t>
@@ -296,10 +296,10 @@
       </w:pPr>
       <w:r>
         <w:rPr>
+          <w:rFonts w:ascii="Arial" w:hAnsi="Arial" w:cs="Arial"/>
           <w:b/>
           <w:color w:val="1B2A1B"/>
           <w:sz w:val="22"/>
-          <w:rFonts w:ascii="Arial" w:hAnsi="Arial" w:cs="Arial"/>
           <w:rtl/>
         </w:rPr>
         <w:t>📋 الفصل 2: مدة العقد، أيام العمل والراحة الأسبوعية، واستثناء الظروف الجوية</w:t>
@@ -312,9 +312,9 @@
       </w:pPr>
       <w:r>
         <w:rPr>
+          <w:rFonts w:ascii="Arial" w:hAnsi="Arial" w:cs="Arial"/>
           <w:color w:val="282828"/>
           <w:sz w:val="19"/>
-          <w:rFonts w:ascii="Arial" w:hAnsi="Arial" w:cs="Arial"/>
           <w:rtl/>
         </w:rPr>
         <w:t>يباشر الطرف الأول تنفيذ أعمال الجني الميدانية بداية من يوم: [ ...... / ...... / 2026 ]، وتستمر الأشغال حتى الانتهاء التام من جمع كامل محصول صابة الزيتون المتفق عليه.</w:t>
@@ -334,10 +334,10 @@
       </w:pPr>
       <w:r>
         <w:rPr>
+          <w:rFonts w:ascii="Arial" w:hAnsi="Arial" w:cs="Arial"/>
           <w:b/>
           <w:color w:val="1B2A1B"/>
           <w:sz w:val="22"/>
-          <w:rFonts w:ascii="Arial" w:hAnsi="Arial" w:cs="Arial"/>
           <w:rtl/>
         </w:rPr>
         <w:t>📋 الفصل 3: التزامات الطرفين بخصوص الآلات والمعدات والتجهيزات</w:t>
@@ -350,9 +350,9 @@
       </w:pPr>
       <w:r>
         <w:rPr>
+          <w:rFonts w:ascii="Arial" w:hAnsi="Arial" w:cs="Arial"/>
           <w:color w:val="282828"/>
           <w:sz w:val="19"/>
-          <w:rFonts w:ascii="Arial" w:hAnsi="Arial" w:cs="Arial"/>
           <w:rtl/>
         </w:rPr>
         <w:t>نظراً لتوفر جانب هام من المعدات لدى صاحب الضيعة وحرصاً على التكامل التقني بين الطرفين، تم ضبط الالتزامات والمعدات كما يلي:</w:t>
@@ -390,10 +390,10 @@
       </w:pPr>
       <w:r>
         <w:rPr>
+          <w:rFonts w:ascii="Arial" w:hAnsi="Arial" w:cs="Arial"/>
           <w:b/>
           <w:color w:val="1B2A1B"/>
           <w:sz w:val="22"/>
-          <w:rFonts w:ascii="Arial" w:hAnsi="Arial" w:cs="Arial"/>
           <w:rtl/>
         </w:rPr>
         <w:t>📋 الفصل 4: المقابل المالي، الأوزان بالضيعة، وجدول الخلاص</w:t>
@@ -406,9 +406,9 @@
       </w:pPr>
       <w:r>
         <w:rPr>
+          <w:rFonts w:ascii="Arial" w:hAnsi="Arial" w:cs="Arial"/>
           <w:color w:val="282828"/>
           <w:sz w:val="19"/>
-          <w:rFonts w:ascii="Arial" w:hAnsi="Arial" w:cs="Arial"/>
           <w:rtl/>
         </w:rPr>
         <w:t>• سعر الجني الصافي: حُدد سعر الجني الصافي بمبلغ ثلاثمائة وأربعون مليماً (0.340 د) عن الكيلوغرام الواحد الصافي المجني دون احتساب الأداء.</w:t>
@@ -431,10 +431,10 @@
       </w:pPr>
       <w:r>
         <w:rPr>
+          <w:rFonts w:ascii="Arial" w:hAnsi="Arial" w:cs="Arial"/>
           <w:b/>
           <w:color w:val="1B2A1B"/>
           <w:sz w:val="22"/>
-          <w:rFonts w:ascii="Arial" w:hAnsi="Arial" w:cs="Arial"/>
           <w:rtl/>
         </w:rPr>
         <w:t>📋 الفصل 5: المسؤولية والسلامة المهنية</w:t>
@@ -447,9 +447,9 @@
       </w:pPr>
       <w:r>
         <w:rPr>
+          <w:rFonts w:ascii="Arial" w:hAnsi="Arial" w:cs="Arial"/>
           <w:color w:val="282828"/>
           <w:sz w:val="19"/>
-          <w:rFonts w:ascii="Arial" w:hAnsi="Arial" w:cs="Arial"/>
           <w:rtl/>
         </w:rPr>
         <w:t>يلتزم الطرف الأول بتطبيق قواعد السلامة المهنية لعملته داخل الضيعة، ويتعهد بعدم إحداث أي ضرر بأشجار أو تجهيزات ضيعات الطرف الثاني خارج إطار الاستغلال الفلاحي العادي، وإلا كان مسؤولاً مدنياً طبقاً لأحكام الفصول 82 و83 من مجلة الالتزامات والعقود التونسية.</w:t>
@@ -463,10 +463,10 @@
       </w:pPr>
       <w:r>
         <w:rPr>
+          <w:rFonts w:ascii="Arial" w:hAnsi="Arial" w:cs="Arial"/>
           <w:b/>
           <w:color w:val="1B2A1B"/>
           <w:sz w:val="22"/>
-          <w:rFonts w:ascii="Arial" w:hAnsi="Arial" w:cs="Arial"/>
           <w:rtl/>
         </w:rPr>
         <w:t>📋 الفصل 6: فسخ العقد</w:t>
@@ -479,9 +479,9 @@
       </w:pPr>
       <w:r>
         <w:rPr>
+          <w:rFonts w:ascii="Arial" w:hAnsi="Arial" w:cs="Arial"/>
           <w:color w:val="282828"/>
           <w:sz w:val="19"/>
-          <w:rFonts w:ascii="Arial" w:hAnsi="Arial" w:cs="Arial"/>
           <w:rtl/>
         </w:rPr>
         <w:t>يجوز فسخ هذا العقد باتفاق الطرفين كتابياً بالتراضي. وفي صورة إخلال أحد الطرفين بأحد التزاماته الجوهرية (كتأخر الطرف الثاني عن خلاص المستحقات بعد انقضاء 15 يوماً، أو توقف الطرف الأول غير المبرر)، يتم التنبيه على الطرف المخل بمراسلة مضمونة الوصول مع الإعلام بالبلوغ، وإذا لم يُرفع الإخلال خلال أجل خمسة (5) أيام، يُفسخ العقد وجوباً مع حفظ حق الطرف المتضرر في التعويض.</w:t>
@@ -495,10 +495,10 @@
       </w:pPr>
       <w:r>
         <w:rPr>
+          <w:rFonts w:ascii="Arial" w:hAnsi="Arial" w:cs="Arial"/>
           <w:b/>
           <w:color w:val="1B2A1B"/>
           <w:sz w:val="22"/>
-          <w:rFonts w:ascii="Arial" w:hAnsi="Arial" w:cs="Arial"/>
           <w:rtl/>
         </w:rPr>
         <w:t>📋 الفصل 7: المحكمة المختصة والقانون المنطبق</w:t>
@@ -511,9 +511,9 @@
       </w:pPr>
       <w:r>
         <w:rPr>
+          <w:rFonts w:ascii="Arial" w:hAnsi="Arial" w:cs="Arial"/>
           <w:color w:val="282828"/>
           <w:sz w:val="19"/>
-          <w:rFonts w:ascii="Arial" w:hAnsi="Arial" w:cs="Arial"/>
           <w:rtl/>
         </w:rPr>
         <w:t>يخضع هذا العقد ويفسر طبقاً لأحكام القانون التونسي. وفي حال نشوء أي نزاع يتعذر تسويته ودياً بين الطرفين، تختص محاكم تونس 1 حصرياً بالنظر فيه والبت فيه.</w:t>
@@ -525,10 +525,10 @@
     <w:p/>
     <w:tbl>
       <w:tblPr>
+        <w:bidiVisual/>
         <w:tblW w:type="auto" w:w="0"/>
         <w:jc w:val="center"/>
         <w:tblLook w:firstColumn="1" w:firstRow="1" w:lastColumn="0" w:lastRow="0" w:noHBand="0" w:noVBand="1" w:val="04A0"/>
-        <w:bidiVisual/>
       </w:tblPr>
       <w:tblGrid>
         <w:gridCol w:w="5018"/>
@@ -538,6 +538,12 @@
         <w:tc>
           <w:tcPr>
             <w:tcW w:type="dxa" w:w="5018"/>
+            <w:tcBorders>
+              <w:top w:val="single" w:sz="8" w:space="0" w:color="C8A356"/>
+              <w:left w:val="single" w:sz="8" w:space="0" w:color="C8A356"/>
+              <w:bottom w:val="single" w:sz="8" w:space="0" w:color="C8A356"/>
+              <w:right w:val="single" w:sz="8" w:space="0" w:color="C8A356"/>
+            </w:tcBorders>
             <w:shd w:fill="FFFFFF"/>
             <w:tcMar>
               <w:top w:w="100" w:type="dxa"/>
@@ -545,12 +551,6 @@
               <w:left w:w="120" w:type="dxa"/>
               <w:right w:w="120" w:type="dxa"/>
             </w:tcMar>
-            <w:tcBorders>
-              <w:top w:val="single" w:sz="8" w:space="0" w:color="C8A356"/>
-              <w:left w:val="single" w:sz="8" w:space="0" w:color="C8A356"/>
-              <w:bottom w:val="single" w:sz="8" w:space="0" w:color="C8A356"/>
-              <w:right w:val="single" w:sz="8" w:space="0" w:color="C8A356"/>
-            </w:tcBorders>
           </w:tcPr>
           <w:p>
             <w:pPr>
@@ -559,9 +559,9 @@
             </w:pPr>
             <w:r>
               <w:rPr>
+                <w:rFonts w:ascii="Arial" w:hAnsi="Arial" w:cs="Arial"/>
                 <w:b/>
                 <w:sz w:val="18"/>
-                <w:rFonts w:ascii="Arial" w:hAnsi="Arial" w:cs="Arial"/>
                 <w:rtl/>
               </w:rPr>
               <w:t>إمضاء وختم الطرف الأول (مسدي الخدمات):</w:t>
@@ -581,6 +581,12 @@
         <w:tc>
           <w:tcPr>
             <w:tcW w:type="dxa" w:w="5018"/>
+            <w:tcBorders>
+              <w:top w:val="single" w:sz="8" w:space="0" w:color="C8A356"/>
+              <w:left w:val="single" w:sz="8" w:space="0" w:color="C8A356"/>
+              <w:bottom w:val="single" w:sz="8" w:space="0" w:color="C8A356"/>
+              <w:right w:val="single" w:sz="8" w:space="0" w:color="C8A356"/>
+            </w:tcBorders>
             <w:shd w:fill="FFFFFF"/>
             <w:tcMar>
               <w:top w:w="100" w:type="dxa"/>
@@ -588,12 +594,6 @@
               <w:left w:w="120" w:type="dxa"/>
               <w:right w:w="120" w:type="dxa"/>
             </w:tcMar>
-            <w:tcBorders>
-              <w:top w:val="single" w:sz="8" w:space="0" w:color="C8A356"/>
-              <w:left w:val="single" w:sz="8" w:space="0" w:color="C8A356"/>
-              <w:bottom w:val="single" w:sz="8" w:space="0" w:color="C8A356"/>
-              <w:right w:val="single" w:sz="8" w:space="0" w:color="C8A356"/>
-            </w:tcBorders>
           </w:tcPr>
           <w:p>
             <w:pPr>
@@ -602,9 +602,9 @@
             </w:pPr>
             <w:r>
               <w:rPr>
+                <w:rFonts w:ascii="Arial" w:hAnsi="Arial" w:cs="Arial"/>
                 <w:b/>
                 <w:sz w:val="18"/>
-                <w:rFonts w:ascii="Arial" w:hAnsi="Arial" w:cs="Arial"/>
                 <w:rtl/>
               </w:rPr>
               <w:t>إمضاء وختم الطرف الثاني (صاحب الضيعة):</w:t>
@@ -631,9 +631,9 @@
       </w:pPr>
       <w:r>
         <w:rPr>
+          <w:rFonts w:ascii="Arial" w:hAnsi="Arial" w:cs="Arial"/>
           <w:color w:val="8C8C8C"/>
           <w:sz w:val="17"/>
-          <w:rFonts w:ascii="Arial" w:hAnsi="Arial" w:cs="Arial"/>
           <w:rtl/>
         </w:rPr>
         <w:t>وثيقة تعاقدية رسمية — شركة منصة الزين لزيت الزيتون التونسي (ZinToop SUARL) • تونس / القيروان</w:t>

</xml_diff>